<commit_message>
court(wisctapp): opening-brief date and signature one block, counsel spacing above each group (fb-595.54.46)
The date (when given) and the signature never split, so the kept conclusion stays with the whole signature (the
answering brief set its signature alone on a page otherwise); the cover's counsel groups take their space above, so
LaTeX sets no trailing space at a cover without a phone line. Checks as before: typst 8/0, latex 9/0 (XENG reported),
docx 11/0 (XENG-003 reported).

Co-Authored-By: Claude Opus 5.5 <noreply@anthropic.com>
</commit_message>
<xml_diff>
--- a/courts/seventh-circuit/wisconsin/state/court-of-appeals/opening-brief/usage/OUTPUT-opening-brief.docx
+++ b/courts/seventh-circuit/wisconsin/state/court-of-appeals/opening-brief/usage/OUTPUT-opening-brief.docx
@@ -11414,6 +11414,11 @@
           <w:tcPr>
             <w:tcW w:w="8640" w:type="dxa"/>
           </w:tcPr>
+          <w:p>
+            <w:pPr>
+              <w:spacing w:before="0" w:after="0" w:line="104" w:lineRule="exact"/>
+            </w:pPr>
+          </w:p>
           <w:tbl>
             <w:tblPr>
               <w:tblW w:w="8640" w:type="dxa"/>
@@ -12031,6 +12036,11 @@
           <w:tcPr>
             <w:tcW w:w="8640" w:type="dxa"/>
           </w:tcPr>
+          <w:p>
+            <w:pPr>
+              <w:spacing w:before="0" w:after="0" w:line="104" w:lineRule="exact"/>
+            </w:pPr>
+          </w:p>
           <w:tbl>
             <w:tblPr>
               <w:tblW w:w="8640" w:type="dxa"/>

</xml_diff>